<commit_message>
Add deterministic Word reference ejection and style showcase (T43)
</commit_message>
<xml_diff>
--- a/tests/fixtures/docx/reference.docx
+++ b/tests/fixtures/docx/reference.docx
@@ -22,11 +22,49 @@
 </file>
 
 <file path=word/header1.xml><?xml version="1.0" encoding="utf-8"?>
-<w:hdr xmlns:w="http://schemas.openxmlformats.org/wordprocessingml/2006/main">
+<w:hdr xmlns:w="http://schemas.openxmlformats.org/wordprocessingml/2006/main" xmlns:r="http://schemas.openxmlformats.org/officeDocument/2006/relationships" xmlns:a="http://schemas.openxmlformats.org/drawingml/2006/main" xmlns:wp="http://schemas.openxmlformats.org/drawingml/2006/wordprocessingDrawing" xmlns:pic="http://schemas.openxmlformats.org/drawingml/2006/picture">
   <w:p>
+    <w:bookmarkStart w:id="12001" w:name="ReferenceHeader"/>
     <w:r>
       <w:t xml:space="preserve">REFERENCE HEADER</w:t>
     </w:r>
+    <w:r>
+      <w:drawing>
+        <wp:inline>
+          <wp:extent cx="1219200" cy="609600"/>
+          <wp:docPr id="9001" name="Reference header picture" descr="Reference PNG"/>
+          <wp:cNvGraphicFramePr>
+            <a:graphicFrameLocks noChangeAspect="1"/>
+          </wp:cNvGraphicFramePr>
+          <a:graphic>
+            <a:graphicData uri="http://schemas.openxmlformats.org/drawingml/2006/picture">
+              <pic:pic>
+                <pic:nvPicPr>
+                  <pic:cNvPr id="0" name="header-image.png"/>
+                  <pic:cNvPicPr/>
+                </pic:nvPicPr>
+                <pic:blipFill>
+                  <a:blip r:embed="rIdHeaderImage"/>
+                  <a:stretch>
+                    <a:fillRect/>
+                  </a:stretch>
+                </pic:blipFill>
+                <pic:spPr>
+                  <a:xfrm>
+                    <a:off x="0" y="0"/>
+                    <a:ext cx="1219200" cy="609600"/>
+                  </a:xfrm>
+                  <a:prstGeom prst="rect">
+                    <a:avLst/>
+                  </a:prstGeom>
+                </pic:spPr>
+              </pic:pic>
+            </a:graphicData>
+          </a:graphic>
+        </wp:inline>
+      </w:drawing>
+    </w:r>
+    <w:bookmarkEnd w:id="12001"/>
   </w:p>
 </w:hdr>
 </file>
@@ -85,7 +123,116 @@
 </file>
 
 <file path=word/theme/theme1.xml><?xml version="1.0" encoding="utf-8"?>
-<a:theme xmlns:a="http://schemas.openxmlformats.org/drawingml/2006/main" name="Reference Theme">
-  <a:themeElements/>
+<a:theme xmlns:a="http://schemas.openxmlformats.org/drawingml/2006/main" xmlns:r="http://schemas.openxmlformats.org/officeDocument/2006/relationships" name="Reference Theme">
+  <a:themeElements>
+    <a:clrScheme name="Reference">
+      <a:dk1>
+        <a:srgbClr val="000000"/>
+      </a:dk1>
+      <a:lt1>
+        <a:srgbClr val="FFFFFF"/>
+      </a:lt1>
+      <a:dk2>
+        <a:srgbClr val="222222"/>
+      </a:dk2>
+      <a:lt2>
+        <a:srgbClr val="EEEEEE"/>
+      </a:lt2>
+      <a:accent1>
+        <a:srgbClr val="4472C4"/>
+      </a:accent1>
+      <a:accent2>
+        <a:srgbClr val="ED7D31"/>
+      </a:accent2>
+      <a:accent3>
+        <a:srgbClr val="A5A5A5"/>
+      </a:accent3>
+      <a:accent4>
+        <a:srgbClr val="FFC000"/>
+      </a:accent4>
+      <a:accent5>
+        <a:srgbClr val="5B9BD5"/>
+      </a:accent5>
+      <a:accent6>
+        <a:srgbClr val="70AD47"/>
+      </a:accent6>
+      <a:hlink>
+        <a:srgbClr val="0563C1"/>
+      </a:hlink>
+      <a:folHlink>
+        <a:srgbClr val="954F72"/>
+      </a:folHlink>
+    </a:clrScheme>
+    <a:fontScheme name="Reference">
+      <a:majorFont>
+        <a:latin typeface="Reference Font"/>
+        <a:ea typeface=""/>
+        <a:cs typeface=""/>
+      </a:majorFont>
+      <a:minorFont>
+        <a:latin typeface="Reference Font"/>
+        <a:ea typeface=""/>
+        <a:cs typeface=""/>
+      </a:minorFont>
+    </a:fontScheme>
+    <a:fmtScheme name="Reference">
+      <a:fillStyleLst>
+        <a:blipFill dpi="0" rotWithShape="1">
+          <a:blip r:embed="rIdThemeImage"/>
+          <a:stretch>
+            <a:fillRect/>
+          </a:stretch>
+        </a:blipFill>
+        <a:solidFill>
+          <a:schemeClr val="phClr"/>
+        </a:solidFill>
+        <a:solidFill>
+          <a:schemeClr val="phClr"/>
+        </a:solidFill>
+      </a:fillStyleLst>
+      <a:lnStyleLst>
+        <a:ln w="12700">
+          <a:solidFill>
+            <a:schemeClr val="phClr"/>
+          </a:solidFill>
+          <a:prstDash val="solid"/>
+        </a:ln>
+        <a:ln w="12700">
+          <a:solidFill>
+            <a:schemeClr val="phClr"/>
+          </a:solidFill>
+          <a:prstDash val="solid"/>
+        </a:ln>
+        <a:ln w="12700">
+          <a:solidFill>
+            <a:schemeClr val="phClr"/>
+          </a:solidFill>
+          <a:prstDash val="solid"/>
+        </a:ln>
+      </a:lnStyleLst>
+      <a:effectStyleLst>
+        <a:effectStyle>
+          <a:effectLst/>
+        </a:effectStyle>
+        <a:effectStyle>
+          <a:effectLst/>
+        </a:effectStyle>
+        <a:effectStyle>
+          <a:effectLst/>
+        </a:effectStyle>
+      </a:effectStyleLst>
+      <a:bgFillStyleLst>
+        <a:solidFill>
+          <a:schemeClr val="phClr"/>
+        </a:solidFill>
+        <a:solidFill>
+          <a:schemeClr val="phClr"/>
+        </a:solidFill>
+        <a:solidFill>
+          <a:schemeClr val="phClr"/>
+        </a:solidFill>
+      </a:bgFillStyleLst>
+    </a:fmtScheme>
+  </a:themeElements>
 </a:theme>
 </file>
</xml_diff>